<commit_message>
fix(annotated): take the newer byline, re-render every example
Carried over from the installed skill copy: the masthead no longer drops a cell
onto a second row when it runs out of width. Only the longest value is allowed
to wrap, and the tokens that stop reading when split — a time range, an address,
a room code — are marked nowrap by the renderer instead. With a sticky note
taking width off the row, the old rule pushed "reply within" off the line
entirely.

Every example is re-rendered and every README png regenerated, since the change
is in render.py and reaches all five themes.

Constraint: one letter page per theme, verified by PDF page count
Confidence: high
Scope-risk: narrow
Not-tested: a byline long enough to need the wrap AND a sticky note, which is the case the nowrap spans exist for
</commit_message>
<xml_diff>
--- a/example/out/sample-annotated.docx
+++ b/example/out/sample-annotated.docx
@@ -17,12 +17,13 @@
         </w:tblBorders>
       </w:tblPr>
       <w:tblGrid>
-        <w:gridCol w:w="11088"/>
+        <w:gridCol w:w="5544"/>
+        <w:gridCol w:w="5544"/>
       </w:tblGrid>
       <w:tr>
         <w:tc>
           <w:tcPr>
-            <w:tcW w:type="dxa" w:w="11088"/>
+            <w:tcW w:type="dxa" w:w="8784"/>
           </w:tcPr>
           <w:p>
             <w:pPr>
@@ -36,6 +37,40 @@
                 <w:sz w:val="52"/>
               </w:rPr>
               <w:t>Algebra 2: Quick Reference</w:t>
+            </w:r>
+          </w:p>
+        </w:tc>
+        <w:tc>
+          <w:tcPr>
+            <w:tcW w:type="dxa" w:w="2304"/>
+            <w:shd w:val="clear" w:fill="FFE580"/>
+          </w:tcPr>
+          <w:p>
+            <w:pPr>
+              <w:spacing w:before="60" w:after="0" w:line="228" w:lineRule="auto"/>
+            </w:pPr>
+            <w:r/>
+            <w:r>
+              <w:rPr>
+                <w:rFonts w:ascii="Segoe Script" w:hAnsi="Segoe Script"/>
+                <w:b/>
+                <w:color w:val="7A2626"/>
+                <w:sz w:val="24"/>
+              </w:rPr>
+              <w:t>Read this first</w:t>
+            </w:r>
+          </w:p>
+          <w:p>
+            <w:pPr>
+              <w:spacing w:before="0" w:after="60" w:line="228" w:lineRule="auto"/>
+            </w:pPr>
+            <w:r>
+              <w:rPr>
+                <w:rFonts w:ascii="Segoe Script" w:hAnsi="Segoe Script"/>
+                <w:color w:val="191C21"/>
+                <w:sz w:val="20"/>
+              </w:rPr>
+              <w:t>the syllabus is longer. this is the part you need.</w:t>
             </w:r>
           </w:p>
         </w:tc>

</xml_diff>